<commit_message>
ICPE: introduction topology figure and script, template
Co-Authored-By: Claude Opus 5.5 <noreply@anthropic.com>
</commit_message>
<xml_diff>
--- a/PCB-Design/reports/paper/icpe/WrittenByHand/ICPE_Template.docx
+++ b/PCB-Design/reports/paper/icpe/WrittenByHand/ICPE_Template.docx
@@ -326,62 +326,12 @@
     <w:p>
       <w:pPr>
         <w:spacing w:line="276" w:lineRule="auto"/>
-        <w:ind w:firstLine="202"/>
         <w:jc w:val="both"/>
         <w:rPr>
           <w:sz w:val="22"/>
           <w:szCs w:val="22"/>
         </w:rPr>
       </w:pPr>
-      <w:r>
-        <w:rPr>
-          <w:sz w:val="22"/>
-          <w:szCs w:val="22"/>
-        </w:rPr>
-        <w:t xml:space="preserve">Electrification is driving traction and fast-charging power levels toward several hundred kilowatts, while demands for efficiency and power density continue to increase. Raising the dc-link voltage is a key design choice for meeting these requirements, although traction inverters must still deliver substantial phase current. In a conventional two-level </w:t>
-      </w:r>
-      <w:r>
-        <w:rPr>
-          <w:sz w:val="22"/>
-          <w:szCs w:val="22"/>
-        </w:rPr>
-        <w:t>traction inverter</w:t>
-      </w:r>
-      <w:r>
-        <w:rPr>
-          <w:sz w:val="22"/>
-          <w:szCs w:val="22"/>
-        </w:rPr>
-        <w:t>, each switch must block the full dc-link voltage and conduct the phase current, making semiconductor losses a central design constraint.</w:t>
-      </w:r>
-      <w:r>
-        <w:rPr>
-          <w:sz w:val="22"/>
-          <w:szCs w:val="22"/>
-        </w:rPr>
-        <w:t xml:space="preserve"> </w:t>
-      </w:r>
-      <w:r>
-        <w:rPr>
-          <w:sz w:val="22"/>
-          <w:szCs w:val="22"/>
-        </w:rPr>
-        <w:t>The stacked polyphase bridge (SPB) introduces an additional design degree of freedom by connecting three-phase bridges in series on the dc side, with each bridge feeding an isolated winding set of a multiphase machine [1], [2]. Distributing the dc-link voltage among submodules allows each bridge to use a lower semiconductor voltage class and apply smaller voltage steps to its winding set. Consequently, voltage partitioning becomes an active design choice that links the converter architecture to device selection.</w:t>
-      </w:r>
-      <w:r>
-        <w:rPr>
-          <w:sz w:val="22"/>
-          <w:szCs w:val="22"/>
-        </w:rPr>
-        <w:t xml:space="preserve"> </w:t>
-      </w:r>
-      <w:r>
-        <w:rPr>
-          <w:sz w:val="22"/>
-          <w:szCs w:val="22"/>
-        </w:rPr>
-        <w:t>The benefit of this freedom depends on realizing a practical high-current submodule. Increasing the number of submodules reduces the voltage across each bridge but does not reduce the phase current for a given total drive power, dc-link voltage, modulation index, and power factor. The design must therefore combine the potential loss advantages of low-voltage devices with the current-handling capability, current sharing, and parasitic constraints of the physical building block.</w:t>
-      </w:r>
     </w:p>
     <w:p>
       <w:pPr>
@@ -392,6 +342,13 @@
           <w:szCs w:val="22"/>
         </w:rPr>
       </w:pPr>
+      <w:r>
+        <w:rPr>
+          <w:sz w:val="22"/>
+          <w:szCs w:val="22"/>
+        </w:rPr>
+        <w:t>Electrification is driving traction and fast-charging power levels toward several hundred kilowatts, while demands for efficiency and power density continue to increase. Raising the dc-link voltage is a key design choice for meeting these requirements, although traction inverters must still deliver substantial phase current. In a conventional two-level traction inverter, each switch must block the full dc-link voltage and conduct the phase current, making semiconductor losses a central design constraint. The stacked polyphase bridge (SPB) introduces an additional design degree of freedom by connecting three-phase bridges in series on the dc side, with each bridge feeding an isolated winding set of a multiphase machine [1], [2]. Fig. 1 illustrates the SPB topology and the phase-leg building block considered in this work. Distributing the dc-link voltage among submodules allows each bridge to use a lower semiconductor voltage class and apply smaller voltage steps to its winding set. Voltage partitioning therefore becomes an active design choice that links the converter architecture to device selection.</w:t>
+      </w:r>
     </w:p>
     <w:p>
       <w:pPr>
@@ -402,96 +359,73 @@
           <w:szCs w:val="22"/>
         </w:rPr>
       </w:pPr>
-      <w:r>
-        <w:rPr>
-          <w:sz w:val="22"/>
-          <w:szCs w:val="22"/>
-        </w:rPr>
-        <w:t>Low-voltage</w:t>
-      </w:r>
-      <w:r>
-        <w:rPr>
-          <w:sz w:val="22"/>
-          <w:szCs w:val="22"/>
-        </w:rPr>
-        <w:t xml:space="preserve"> gallium nitride (GaN) </w:t>
-      </w:r>
-      <w:r>
-        <w:rPr>
-          <w:sz w:val="22"/>
-          <w:szCs w:val="22"/>
-        </w:rPr>
-        <w:t>devices</w:t>
-      </w:r>
-      <w:r>
-        <w:rPr>
-          <w:sz w:val="22"/>
-          <w:szCs w:val="22"/>
-        </w:rPr>
-        <w:t xml:space="preserve"> can offer favorable on-resistance and switching charge, yet several devices may be needed in parallel. Their current sharing, gate drive, and commutation paths then determine how much of the expected loss benefit can be retained. The additional submodules also repeat the gate-drive, auxiliary-supply, and interconnection requirements throughout the converter.</w:t>
+    </w:p>
+    <w:p>
+      <w:pPr>
+        <w:keepNext/>
+        <w:spacing w:line="276" w:lineRule="auto"/>
+        <w:jc w:val="center"/>
+      </w:pPr>
+      <w:r>
+        <w:rPr>
+          <w:noProof/>
+        </w:rPr>
+        <w:drawing>
+          <wp:inline distT="0" distB="0" distL="0" distR="0" wp14:anchorId="7E5C3BF2" wp14:editId="32548CFB">
+            <wp:extent cx="3141896" cy="1505034"/>
+            <wp:effectExtent l="0" t="0" r="1905" b="0"/>
+            <wp:docPr id="754163640" name="Graphic 1"/>
+            <wp:cNvGraphicFramePr>
+              <a:graphicFrameLocks xmlns:a="http://schemas.openxmlformats.org/drawingml/2006/main" noChangeAspect="1"/>
+            </wp:cNvGraphicFramePr>
+            <a:graphic xmlns:a="http://schemas.openxmlformats.org/drawingml/2006/main">
+              <a:graphicData uri="http://schemas.openxmlformats.org/drawingml/2006/picture">
+                <pic:pic xmlns:pic="http://schemas.openxmlformats.org/drawingml/2006/picture">
+                  <pic:nvPicPr>
+                    <pic:cNvPr id="754163640" name=""/>
+                    <pic:cNvPicPr/>
+                  </pic:nvPicPr>
+                  <pic:blipFill>
+                    <a:blip r:embed="rId9">
+                      <a:extLst>
+                        <a:ext uri="{96DAC541-7B7A-43D3-8B79-37D633B846F1}">
+                          <asvg:svgBlip xmlns:asvg="http://schemas.microsoft.com/office/drawing/2016/SVG/main" r:embed="rId10"/>
+                        </a:ext>
+                      </a:extLst>
+                    </a:blip>
+                    <a:stretch>
+                      <a:fillRect/>
+                    </a:stretch>
+                  </pic:blipFill>
+                  <pic:spPr>
+                    <a:xfrm>
+                      <a:off x="0" y="0"/>
+                      <a:ext cx="3146104" cy="1507050"/>
+                    </a:xfrm>
+                    <a:prstGeom prst="rect">
+                      <a:avLst/>
+                    </a:prstGeom>
+                  </pic:spPr>
+                </pic:pic>
+              </a:graphicData>
+            </a:graphic>
+          </wp:inline>
+        </w:drawing>
       </w:r>
     </w:p>
     <w:p>
       <w:pPr>
         <w:spacing w:line="276" w:lineRule="auto"/>
         <w:jc w:val="both"/>
-        <w:rPr>
-          <w:sz w:val="22"/>
-          <w:szCs w:val="22"/>
-        </w:rPr>
-      </w:pPr>
-      <w:r>
-        <w:rPr>
-          <w:sz w:val="22"/>
-          <w:szCs w:val="22"/>
-        </w:rPr>
-        <w:t>The literature establishes SPB modulation and loss characteristics [</w:t>
-      </w:r>
-      <w:proofErr w:type="gramStart"/>
-      <w:r>
-        <w:rPr>
-          <w:sz w:val="22"/>
-          <w:szCs w:val="22"/>
-        </w:rPr>
-        <w:t>2]</w:t>
-      </w:r>
-      <w:proofErr w:type="gramEnd"/>
-      <w:r>
-        <w:rPr>
-          <w:sz w:val="22"/>
-          <w:szCs w:val="22"/>
-        </w:rPr>
-        <w:t>, [3], dc-link stability [4], and comparisons with alternative GaN converter systems [5]. These studies provide the system context for selecting a submodule voltage. Work on paralleled GaN stages identifies complementary hardware constraints, including commutation-loop inductance, source coupling, and unequal gate impedances [6]</w:t>
-      </w:r>
-      <w:proofErr w:type="gramStart"/>
-      <w:r>
-        <w:rPr>
-          <w:sz w:val="22"/>
-          <w:szCs w:val="22"/>
-        </w:rPr>
-        <w:t>–[</w:t>
-      </w:r>
-      <w:proofErr w:type="gramEnd"/>
-      <w:r>
-        <w:rPr>
-          <w:sz w:val="22"/>
-          <w:szCs w:val="22"/>
-        </w:rPr>
-        <w:t xml:space="preserve">8]. Taken together, these results indicate that the voltage partition cannot be selected from device data alone: the chosen </w:t>
-      </w:r>
-      <w:r>
-        <w:rPr>
-          <w:sz w:val="22"/>
-          <w:szCs w:val="22"/>
-        </w:rPr>
-        <w:t>low-voltage</w:t>
-      </w:r>
-      <w:r>
-        <w:rPr>
-          <w:sz w:val="22"/>
-          <w:szCs w:val="22"/>
-        </w:rPr>
-        <w:t xml:space="preserve"> bridge must also be realizable at the required traction current.</w:t>
+      </w:pPr>
+      <w:r>
+        <w:t>Fig. 1</w:t>
+      </w:r>
+      <w:r>
+        <w:t>:</w:t>
+      </w:r>
+      <w:r>
+        <w:t xml:space="preserve"> (a) SPB traction-drive topology with (N) series-connected submodules, each supplying an isolated three-phase winding set of a common machine. (b) Three-phase submodule with the studied phase leg highlighted. Each switch symbol represents four parallel GaN transistors; the diode denotes the equivalent reverse-conduction path.</w:t>
       </w:r>
     </w:p>
     <w:p>
@@ -503,14 +437,6 @@
           <w:szCs w:val="22"/>
         </w:rPr>
       </w:pPr>
-      <w:r>
-        <w:rPr>
-          <w:sz w:val="22"/>
-          <w:szCs w:val="22"/>
-        </w:rPr>
-        <w:lastRenderedPageBreak/>
-        <w:t>The problem addressed here is therefore the coupling between SPB voltage partition and building-block implementation. A larger number of lower-voltage submodules may improve the device-level loss comparison, but insufficient switching margin can force slower commutation or a further reduction of submodule voltage. Conversely, reducing the commutation inductance may allow the selected voltage partition to be retained. Gate-loop impedance determines whether that low-inductance power stage can be driven without excessive gate disturbance or unequal transient loading. The hardware constraints feed back into the converter architecture.</w:t>
-      </w:r>
     </w:p>
     <w:p>
       <w:pPr>
@@ -519,16 +445,226 @@
         <w:rPr>
           <w:sz w:val="22"/>
           <w:szCs w:val="22"/>
-          <w:lang w:eastAsia="ko-KR"/>
-        </w:rPr>
-      </w:pPr>
-      <w:r>
-        <w:rPr>
-          <w:sz w:val="22"/>
-          <w:szCs w:val="22"/>
-        </w:rPr>
-        <w:t>This paper develops a phase-leg building block through that feedback. Its contribution is a design sequence that turns the traction-current requirement into a single-cell switching study and a small parallel-count comparison, then translates the selected count into a paired gate drive and a routed board. Extraction of the power and gate networks closes the assumptions made during this first-pass sizing. An instrumented double-pulse test (DPT) board and an operating board separate the parasitics required for measurement from those of the intended converter. The study connects the architecture-level voltage choice to the switching quantities that determine hardware feasibility.</w:t>
-      </w:r>
+        </w:rPr>
+      </w:pPr>
+    </w:p>
+    <w:p>
+      <w:pPr>
+        <w:spacing w:line="276" w:lineRule="auto"/>
+        <w:jc w:val="both"/>
+        <w:rPr>
+          <w:sz w:val="22"/>
+          <w:szCs w:val="22"/>
+        </w:rPr>
+      </w:pPr>
+    </w:p>
+    <w:p>
+      <w:pPr>
+        <w:spacing w:line="276" w:lineRule="auto"/>
+        <w:jc w:val="both"/>
+        <w:rPr>
+          <w:sz w:val="22"/>
+          <w:szCs w:val="22"/>
+        </w:rPr>
+      </w:pPr>
+      <w:r>
+        <w:rPr>
+          <w:sz w:val="22"/>
+          <w:szCs w:val="22"/>
+        </w:rPr>
+        <w:t xml:space="preserve">The benefit of voltage partitioning depends on realizing a practical high-current submodule. Increasing the number of submodules reduces the voltage across each bridge but does not reduce the phase current for a given total drive power, dc-link voltage, modulation index, and power factor. Low-voltage gallium nitride (GaN) devices can offer favorable on-state resistance and switching </w:t>
+      </w:r>
+      <w:r>
+        <w:rPr>
+          <w:sz w:val="22"/>
+          <w:szCs w:val="22"/>
+        </w:rPr>
+        <w:t>performance</w:t>
+      </w:r>
+      <w:r>
+        <w:rPr>
+          <w:sz w:val="22"/>
+          <w:szCs w:val="22"/>
+        </w:rPr>
+        <w:t>, but meeting the traction-current requirement may require several devices in parallel. Current sharing, gate-drive impedance, and commutation-loop parasitics then determine how much of the expected loss benefit can be retained. Increasing the submodule count also increases the number of gate-drive circuits, auxiliary supplies, and interconnections throughout the converter.</w:t>
+      </w:r>
+    </w:p>
+    <w:p>
+      <w:pPr>
+        <w:spacing w:line="276" w:lineRule="auto"/>
+        <w:jc w:val="both"/>
+        <w:rPr>
+          <w:sz w:val="22"/>
+          <w:szCs w:val="22"/>
+        </w:rPr>
+      </w:pPr>
+    </w:p>
+    <w:p>
+      <w:pPr>
+        <w:spacing w:line="276" w:lineRule="auto"/>
+        <w:jc w:val="both"/>
+        <w:rPr>
+          <w:sz w:val="22"/>
+          <w:szCs w:val="22"/>
+        </w:rPr>
+      </w:pPr>
+      <w:r>
+        <w:rPr>
+          <w:sz w:val="22"/>
+          <w:szCs w:val="22"/>
+        </w:rPr>
+        <w:t>Previous studies establish SPB modulation and loss characteristics [2], [3], dc-link stability [4], and comparisons with alternative GaN converter systems [5]. These studies provide the system-level basis for selecting a submodule voltage. Research on paralleled GaN stages identifies complementary implementation constraints, including commutation-loop inductance, common-source coupling, and unequal gate impedances [6]</w:t>
+      </w:r>
+      <w:proofErr w:type="gramStart"/>
+      <w:r>
+        <w:rPr>
+          <w:sz w:val="22"/>
+          <w:szCs w:val="22"/>
+        </w:rPr>
+        <w:t>–[</w:t>
+      </w:r>
+      <w:proofErr w:type="gramEnd"/>
+      <w:r>
+        <w:rPr>
+          <w:sz w:val="22"/>
+          <w:szCs w:val="22"/>
+        </w:rPr>
+        <w:t>8]. Together, these findings motivate a design procedure that considers voltage partitioning and high-current hardware implementation jointly.</w:t>
+      </w:r>
+      <w:r>
+        <w:rPr>
+          <w:sz w:val="22"/>
+          <w:szCs w:val="22"/>
+        </w:rPr>
+        <w:t xml:space="preserve"> </w:t>
+      </w:r>
+      <w:r>
+        <w:rPr>
+          <w:sz w:val="22"/>
+          <w:szCs w:val="22"/>
+        </w:rPr>
+        <w:t>The central challenge is the feedback between the selected submodule voltage and the physical building block. A lower device voltage class may offer favorable loss characteristics, but the available voltage margin must accommodate switching overshoot at the required current. Excessive commutation-loop inductance can require slower switching or a lower submodule operating voltage, potentially changing the initial loss comparison or the required submodule count. Gate-loop impedance and symmetry further constrain switching speed by affecting gate-voltage disturbances and dynamic current sharing. The practical benefits of SPB voltage partitioning therefore depend on optimizing the power and gate networks together.</w:t>
+      </w:r>
+    </w:p>
+    <w:p>
+      <w:pPr>
+        <w:spacing w:line="276" w:lineRule="auto"/>
+        <w:jc w:val="both"/>
+        <w:rPr>
+          <w:sz w:val="22"/>
+          <w:szCs w:val="22"/>
+        </w:rPr>
+      </w:pPr>
+    </w:p>
+    <w:p>
+      <w:pPr>
+        <w:spacing w:line="276" w:lineRule="auto"/>
+        <w:jc w:val="both"/>
+        <w:rPr>
+          <w:sz w:val="22"/>
+          <w:szCs w:val="22"/>
+        </w:rPr>
+      </w:pPr>
+      <w:r>
+        <w:rPr>
+          <w:sz w:val="22"/>
+          <w:szCs w:val="22"/>
+        </w:rPr>
+        <w:t xml:space="preserve">This paper presents a hardware-constrained design procedure for an SPB phase-leg building block. Single-cell switching simulations establish a usable current range per </w:t>
+      </w:r>
+      <w:r>
+        <w:rPr>
+          <w:sz w:val="22"/>
+          <w:szCs w:val="22"/>
+        </w:rPr>
+        <w:t>device</w:t>
+      </w:r>
+      <w:r>
+        <w:rPr>
+          <w:sz w:val="22"/>
+          <w:szCs w:val="22"/>
+        </w:rPr>
+        <w:t>, and a comparison of losses, junction temperature, and voltage stress supports the selection of the parallel-device count. Current-sharing sensitivity then guides the cell arrangement and paired gate-drive configuration. An iterative layout, parasitic-extraction, and circuit-simulation workflow evaluates the routed power and gate networks and revisits the assumptions used during initial sizing. Separate operating and double-pulse test (DPT) boards distinguish the intended converter layout from the additional parasitics introduced by measurement provisions. The contribution is to connect SPB voltage partitioning and device selection to the physical constraints that determine whether the expected advantages of low-voltage devices can be realized at traction-current levels.</w:t>
+      </w:r>
+    </w:p>
+    <w:p>
+      <w:pPr>
+        <w:spacing w:line="276" w:lineRule="auto"/>
+        <w:jc w:val="both"/>
+        <w:rPr>
+          <w:sz w:val="22"/>
+          <w:szCs w:val="22"/>
+        </w:rPr>
+      </w:pPr>
+    </w:p>
+    <w:p>
+      <w:pPr>
+        <w:pStyle w:val="Heading1"/>
+        <w:rPr>
+          <w:b/>
+          <w:sz w:val="24"/>
+          <w:szCs w:val="24"/>
+        </w:rPr>
+      </w:pPr>
+      <w:r>
+        <w:rPr>
+          <w:b/>
+          <w:sz w:val="24"/>
+          <w:szCs w:val="24"/>
+        </w:rPr>
+        <w:t>Traction Requirements And The Initial Device And Voltage Choice</w:t>
+      </w:r>
+    </w:p>
+    <w:p>
+      <w:pPr>
+        <w:spacing w:line="276" w:lineRule="auto"/>
+        <w:jc w:val="both"/>
+        <w:rPr>
+          <w:sz w:val="22"/>
+          <w:szCs w:val="22"/>
+        </w:rPr>
+      </w:pPr>
+    </w:p>
+    <w:p>
+      <w:pPr>
+        <w:spacing w:line="276" w:lineRule="auto"/>
+        <w:jc w:val="both"/>
+        <w:rPr>
+          <w:sz w:val="22"/>
+          <w:szCs w:val="22"/>
+        </w:rPr>
+      </w:pPr>
+    </w:p>
+    <w:p>
+      <w:pPr>
+        <w:spacing w:line="276" w:lineRule="auto"/>
+        <w:jc w:val="both"/>
+        <w:rPr>
+          <w:sz w:val="22"/>
+          <w:szCs w:val="22"/>
+        </w:rPr>
+      </w:pPr>
+    </w:p>
+    <w:p>
+      <w:pPr>
+        <w:spacing w:line="276" w:lineRule="auto"/>
+        <w:jc w:val="both"/>
+        <w:rPr>
+          <w:sz w:val="22"/>
+          <w:szCs w:val="22"/>
+        </w:rPr>
+      </w:pPr>
+    </w:p>
+    <w:p>
+      <w:pPr>
+        <w:spacing w:line="276" w:lineRule="auto"/>
+        <w:jc w:val="both"/>
+        <w:rPr>
+          <w:sz w:val="22"/>
+          <w:szCs w:val="22"/>
+          <w:lang w:eastAsia="ko-KR"/>
+        </w:rPr>
+      </w:pPr>
     </w:p>
     <w:p>
       <w:pPr>
@@ -595,6 +731,7 @@
           <w:szCs w:val="22"/>
           <w:lang w:eastAsia="ko-KR"/>
         </w:rPr>
+        <w:lastRenderedPageBreak/>
         <w:drawing>
           <wp:inline distT="0" distB="0" distL="0" distR="0" wp14:anchorId="645F2561" wp14:editId="3129F99E">
             <wp:extent cx="1695450" cy="1419225"/>
@@ -613,7 +750,7 @@
                     </pic:cNvPicPr>
                   </pic:nvPicPr>
                   <pic:blipFill>
-                    <a:blip r:embed="rId9"/>
+                    <a:blip r:embed="rId11"/>
                     <a:srcRect/>
                     <a:stretch>
                       <a:fillRect/>
@@ -857,7 +994,6 @@
           <w:sz w:val="24"/>
           <w:lang w:eastAsia="ko-KR"/>
         </w:rPr>
-        <w:lastRenderedPageBreak/>
         <mc:AlternateContent>
           <mc:Choice Requires="wpg">
             <w:drawing>
@@ -958,9 +1094,9 @@
                                     <o:lock v:ext="edit" aspectratio="t"/>
                                   </v:shapetype>
                                   <v:shape id="_x0000_i1026" type="#_x0000_t75" style="width:66.75pt;height:174pt" fillcolor="window">
-                                    <v:imagedata r:id="rId10" o:title=""/>
+                                    <v:imagedata r:id="rId12" o:title=""/>
                                   </v:shape>
-                                  <o:OLEObject Type="Embed" ProgID="Equation.3" ShapeID="_x0000_i1026" DrawAspect="Content" ObjectID="_1854776661" r:id="rId11"/>
+                                  <o:OLEObject Type="Embed" ProgID="Equation.3" ShapeID="_x0000_i1026" DrawAspect="Content" ObjectID="_1854780148" r:id="rId13"/>
                                 </w:object>
                               </w:r>
                             </w:p>
@@ -1114,9 +1250,9 @@
                           </w:rPr>
                           <w:object w:dxaOrig="1335" w:dyaOrig="3480" w14:anchorId="71F110AA">
                             <v:shape id="_x0000_i1026" type="#_x0000_t75" style="width:66.75pt;height:174pt" fillcolor="window">
-                              <v:imagedata r:id="rId10" o:title=""/>
+                              <v:imagedata r:id="rId12" o:title=""/>
                             </v:shape>
-                            <o:OLEObject Type="Embed" ProgID="Equation.3" ShapeID="_x0000_i1026" DrawAspect="Content" ObjectID="_1854776661" r:id="rId12"/>
+                            <o:OLEObject Type="Embed" ProgID="Equation.3" ShapeID="_x0000_i1026" DrawAspect="Content" ObjectID="_1854780148" r:id="rId14"/>
                           </w:object>
                         </w:r>
                       </w:p>
@@ -1252,6 +1388,7 @@
           <w:szCs w:val="24"/>
           <w:lang w:eastAsia="ko-KR"/>
         </w:rPr>
+        <w:lastRenderedPageBreak/>
         <w:t>C</w:t>
       </w:r>
       <w:r>
@@ -2586,6 +2723,7 @@
           <w:szCs w:val="22"/>
           <w:lang w:eastAsia="ko-KR"/>
         </w:rPr>
+        <w:lastRenderedPageBreak/>
         <w:t>Please d</w:t>
       </w:r>
       <w:r>
@@ -3959,6 +4097,7 @@
     <w:name w:val="heading 1"/>
     <w:basedOn w:val="Normal"/>
     <w:next w:val="Normal"/>
+    <w:link w:val="Heading1Char"/>
     <w:qFormat/>
     <w:rsid w:val="00E07EB4"/>
     <w:pPr>
@@ -4138,7 +4277,6 @@
   <w:style w:type="character" w:default="1" w:styleId="DefaultParagraphFont">
     <w:name w:val="Default Paragraph Font"/>
     <w:uiPriority w:val="1"/>
-    <w:semiHidden/>
     <w:unhideWhenUsed/>
   </w:style>
   <w:style w:type="table" w:default="1" w:styleId="TableNormal">
@@ -4489,6 +4627,28 @@
       <w:ind w:leftChars="400" w:left="800"/>
     </w:pPr>
   </w:style>
+  <w:style w:type="paragraph" w:styleId="NormalWeb">
+    <w:name w:val="Normal (Web)"/>
+    <w:basedOn w:val="Normal"/>
+    <w:semiHidden/>
+    <w:unhideWhenUsed/>
+    <w:rsid w:val="00013BE4"/>
+    <w:rPr>
+      <w:sz w:val="24"/>
+      <w:szCs w:val="24"/>
+    </w:rPr>
+  </w:style>
+  <w:style w:type="character" w:customStyle="1" w:styleId="Heading1Char">
+    <w:name w:val="Heading 1 Char"/>
+    <w:basedOn w:val="DefaultParagraphFont"/>
+    <w:link w:val="Heading1"/>
+    <w:rsid w:val="00F7616F"/>
+    <w:rPr>
+      <w:smallCaps/>
+      <w:kern w:val="28"/>
+      <w:lang w:eastAsia="en-US"/>
+    </w:rPr>
+  </w:style>
 </w:styles>
 </file>
 

</xml_diff>